<commit_message>
docs(syscsr): QNSC_SYSCSR_MAS V3.2, DBG_BOOT for debug boot
DBG_BOOT in the register map (6), its behaviour in a new 7.5 (firmware
use moves to 7.6), the i_dbg_en port, the sub-module, the requirements on
the top owner (pad) and SYSDBG (bus master), and SYSCSR_011..013.
DOMAIN_RST_STATUS no longer shows a CPU held in debug boot: there is no
hold. DECISIONS records why. Figures: block with DBG_BOOT, the new
dbg_en figure, register fields; docx rebuilt.

Co-Authored-By: Claude Opus 5.5 (1M context) <noreply@anthropic.com>
</commit_message>
<xml_diff>
--- a/doc/specs/docx/QNSC_SYSCSR_MAS.docx
+++ b/doc/specs/docx/QNSC_SYSCSR_MAS.docx
@@ -33,7 +33,7 @@
         <w:t xml:space="preserve"> </w:t>
       </w:r>
       <w:r>
-        <w:t xml:space="preserve">V3.1</w:t>
+        <w:t xml:space="preserve">V3.2</w:t>
       </w:r>
     </w:p>
     <w:p>
@@ -176,6 +176,16 @@
           </w:pPr>
           <w:r>
             <w:t xml:space="preserve">Table 6-5. CHIP_ID_REV fields</w:t>
+          </w:r>
+        </w:p>
+        <w:p>
+          <w:pPr>
+            <w:pStyle w:val="TOC1"/>
+            <w:ind w:left="180"/>
+            <w:jc w:val="left"/>
+          </w:pPr>
+          <w:r>
+            <w:t xml:space="preserve">Table 6-6. DBG_BOOT fields</w:t>
           </w:r>
         </w:p>
         <w:p>
@@ -298,6 +308,16 @@
             <w:t xml:space="preserve">Figure 7-1. RESET_CAUSE across power-on, a firmware clear and a watchdog bite</w:t>
           </w:r>
         </w:p>
+        <w:p>
+          <w:pPr>
+            <w:pStyle w:val="TOC1"/>
+            <w:ind w:left="180"/>
+            <w:jc w:val="left"/>
+          </w:pPr>
+          <w:r>
+            <w:t xml:space="preserve">Figure 7-2. DBG_BOOT.dbg_en: the DBG_EN pin through two flip-flops, forced to 0 by the mask</w:t>
+          </w:r>
+        </w:p>
       </w:sdtContent>
     </w:sdt>
     <w:bookmarkStart w:id="21" w:name="revision-history"/>
@@ -645,6 +665,191 @@
           </w:p>
         </w:tc>
       </w:tr>
+      <w:tr>
+        <w:tc>
+          <w:tcPr/>
+          <w:p>
+            <w:pPr>
+              <w:pStyle w:val="Compact"/>
+              <w:jc w:val="left"/>
+            </w:pPr>
+            <w:r>
+              <w:t xml:space="preserve">V3.2</w:t>
+            </w:r>
+          </w:p>
+        </w:tc>
+        <w:tc>
+          <w:tcPr/>
+          <w:p>
+            <w:pPr>
+              <w:pStyle w:val="Compact"/>
+              <w:jc w:val="left"/>
+            </w:pPr>
+            <w:r>
+              <w:t xml:space="preserve">2026-10-12</w:t>
+            </w:r>
+          </w:p>
+        </w:tc>
+        <w:tc>
+          <w:tcPr/>
+          <w:p>
+            <w:pPr>
+              <w:pStyle w:val="Compact"/>
+              <w:jc w:val="left"/>
+            </w:pPr>
+            <w:r>
+              <w:t xml:space="preserve">Nguyen Hao Nam</w:t>
+            </w:r>
+          </w:p>
+        </w:tc>
+        <w:tc>
+          <w:tcPr/>
+          <w:p>
+            <w:pPr>
+              <w:pStyle w:val="Compact"/>
+              <w:jc w:val="left"/>
+            </w:pPr>
+            <w:r>
+              <w:t xml:space="preserve">–</w:t>
+            </w:r>
+          </w:p>
+        </w:tc>
+        <w:tc>
+          <w:tcPr/>
+          <w:p>
+            <w:pPr>
+              <w:pStyle w:val="Compact"/>
+              <w:jc w:val="left"/>
+            </w:pPr>
+            <w:r>
+              <w:t xml:space="preserve">Mentor’s debug boot flow of 12/10 (</w:t>
+            </w:r>
+            <w:r>
+              <w:rPr>
+                <w:rStyle w:val="VerbatimChar"/>
+              </w:rPr>
+              <w:t xml:space="preserve">QNSC_BOOT_SPEC</w:t>
+            </w:r>
+            <w:r>
+              <w:t xml:space="preserve"> </w:t>
+            </w:r>
+            <w:r>
+              <w:t xml:space="preserve">V3.3): register</w:t>
+            </w:r>
+            <w:r>
+              <w:t xml:space="preserve"> </w:t>
+            </w:r>
+            <w:r>
+              <w:rPr>
+                <w:rStyle w:val="VerbatimChar"/>
+              </w:rPr>
+              <w:t xml:space="preserve">DBG_BOOT</w:t>
+            </w:r>
+            <w:r>
+              <w:t xml:space="preserve"> </w:t>
+            </w:r>
+            <w:r>
+              <w:t xml:space="preserve">at</w:t>
+            </w:r>
+            <w:r>
+              <w:t xml:space="preserve"> </w:t>
+            </w:r>
+            <w:r>
+              <w:rPr>
+                <w:rStyle w:val="VerbatimChar"/>
+              </w:rPr>
+              <w:t xml:space="preserve">0x0C</w:t>
+            </w:r>
+            <w:r>
+              <w:t xml:space="preserve">,</w:t>
+            </w:r>
+            <w:r>
+              <w:t xml:space="preserve"> </w:t>
+            </w:r>
+            <w:r>
+              <w:rPr>
+                <w:rStyle w:val="VerbatimChar"/>
+              </w:rPr>
+              <w:t xml:space="preserve">dbg_en</w:t>
+            </w:r>
+            <w:r>
+              <w:t xml:space="preserve"> </w:t>
+            </w:r>
+            <w:r>
+              <w:t xml:space="preserve">(RO, the</w:t>
+            </w:r>
+            <w:r>
+              <w:t xml:space="preserve"> </w:t>
+            </w:r>
+            <w:r>
+              <w:rPr>
+                <w:rStyle w:val="VerbatimChar"/>
+              </w:rPr>
+              <w:t xml:space="preserve">DBG_EN</w:t>
+            </w:r>
+            <w:r>
+              <w:t xml:space="preserve"> </w:t>
+            </w:r>
+            <w:r>
+              <w:t xml:space="preserve">pin through two flip-flops, forced to 0 by the mask) and</w:t>
+            </w:r>
+            <w:r>
+              <w:t xml:space="preserve"> </w:t>
+            </w:r>
+            <w:r>
+              <w:rPr>
+                <w:rStyle w:val="VerbatimChar"/>
+              </w:rPr>
+              <w:t xml:space="preserve">dbg_en_mask</w:t>
+            </w:r>
+            <w:r>
+              <w:t xml:space="preserve"> </w:t>
+            </w:r>
+            <w:r>
+              <w:t xml:space="preserve">(RW, written by the host over JTAG); port</w:t>
+            </w:r>
+            <w:r>
+              <w:t xml:space="preserve"> </w:t>
+            </w:r>
+            <w:r>
+              <w:rPr>
+                <w:rStyle w:val="VerbatimChar"/>
+              </w:rPr>
+              <w:t xml:space="preserve">i_dbg_en</w:t>
+            </w:r>
+            <w:r>
+              <w:t xml:space="preserve">; sub-module</w:t>
+            </w:r>
+            <w:r>
+              <w:t xml:space="preserve"> </w:t>
+            </w:r>
+            <w:r>
+              <w:rPr>
+                <w:rStyle w:val="VerbatimChar"/>
+              </w:rPr>
+              <w:t xml:space="preserve">m_qnsc_syscsr_dbg_en</w:t>
+            </w:r>
+            <w:r>
+              <w:t xml:space="preserve">; the CPU hold of debug boot no longer appears in</w:t>
+            </w:r>
+            <w:r>
+              <w:t xml:space="preserve"> </w:t>
+            </w:r>
+            <w:r>
+              <w:rPr>
+                <w:rStyle w:val="VerbatimChar"/>
+              </w:rPr>
+              <w:t xml:space="preserve">DOMAIN_RST_STATUS</w:t>
+            </w:r>
+            <w:r>
+              <w:t xml:space="preserve"> </w:t>
+            </w:r>
+            <w:r>
+              <w:t xml:space="preserve">(sections 1, 2, 3, 5, 6, 7.3, 7.5, 8, 11, 12)</w:t>
+            </w:r>
+          </w:p>
+        </w:tc>
+      </w:tr>
     </w:tbl>
     <w:bookmarkEnd w:id="21"/>
     <w:bookmarkStart w:id="22" w:name="overview"/>
@@ -676,7 +881,7 @@
         <w:t xml:space="preserve"> </w:t>
       </w:r>
       <w:r>
-        <w:t xml:space="preserve">reset subsystem. Three read-only registers answer three questions firmware cannot</w:t>
+        <w:t xml:space="preserve">reset subsystem. Three status registers answer three questions firmware cannot</w:t>
       </w:r>
       <w:r>
         <w:t xml:space="preserve"> </w:t>
@@ -715,7 +920,37 @@
         <w:t xml:space="preserve">CHIP_ID_REV</w:t>
       </w:r>
       <w:r>
-        <w:t xml:space="preserve">).</w:t>
+        <w:t xml:space="preserve">). A fourth,</w:t>
+      </w:r>
+      <w:r>
+        <w:t xml:space="preserve"> </w:t>
+      </w:r>
+      <w:r>
+        <w:rPr>
+          <w:rStyle w:val="VerbatimChar"/>
+        </w:rPr>
+        <w:t xml:space="preserve">DBG_BOOT</w:t>
+      </w:r>
+      <w:r>
+        <w:t xml:space="preserve">, tells the boot ROM whether to wait for the debugger before it starts the</w:t>
+      </w:r>
+      <w:r>
+        <w:t xml:space="preserve"> </w:t>
+      </w:r>
+      <w:r>
+        <w:t xml:space="preserve">application, and lets the debugger end that wait (</w:t>
+      </w:r>
+      <w:r>
+        <w:rPr>
+          <w:rStyle w:val="VerbatimChar"/>
+        </w:rPr>
+        <w:t xml:space="preserve">QNSC_BOOT_SPEC</w:t>
+      </w:r>
+      <w:r>
+        <w:t xml:space="preserve"> </w:t>
+      </w:r>
+      <w:r>
+        <w:t xml:space="preserve">7.5).</w:t>
       </w:r>
     </w:p>
     <w:p>
@@ -789,7 +1024,7 @@
         <w:t xml:space="preserve"> </w:t>
       </w:r>
       <w:r>
-        <w:t xml:space="preserve">controls nothing; every control bit is in</w:t>
+        <w:t xml:space="preserve">controls no clock and no reset; every such control bit is in</w:t>
       </w:r>
       <w:r>
         <w:t xml:space="preserve"> </w:t>
@@ -813,7 +1048,25 @@
         <w:t xml:space="preserve">QNSC_SCRC_MAS</w:t>
       </w:r>
       <w:r>
-        <w:t xml:space="preserve">).</w:t>
+        <w:t xml:space="preserve">). Its one writable control bit,</w:t>
+      </w:r>
+      <w:r>
+        <w:t xml:space="preserve"> </w:t>
+      </w:r>
+      <w:r>
+        <w:rPr>
+          <w:rStyle w:val="VerbatimChar"/>
+        </w:rPr>
+        <w:t xml:space="preserve">DBG_BOOT.dbg_en_mask</w:t>
+      </w:r>
+      <w:r>
+        <w:t xml:space="preserve">, only</w:t>
+      </w:r>
+      <w:r>
+        <w:t xml:space="preserve"> </w:t>
+      </w:r>
+      <w:r>
+        <w:t xml:space="preserve">changes what the boot ROM reads.</w:t>
       </w:r>
     </w:p>
     <w:p>
@@ -892,7 +1145,7 @@
         <w:jc w:val="left"/>
       </w:pPr>
       <w:r>
-        <w:t xml:space="preserve">Three 32-bit registers on</w:t>
+        <w:t xml:space="preserve">Four 32-bit registers on</w:t>
       </w:r>
       <w:r>
         <w:t xml:space="preserve"> </w:t>
@@ -1028,7 +1281,34 @@
         <w:jc w:val="left"/>
       </w:pPr>
       <w:r>
-        <w:t xml:space="preserve">Reset by power-on only, on a clock that is never gated – 7.1.</w:t>
+        <w:rPr>
+          <w:rStyle w:val="VerbatimChar"/>
+        </w:rPr>
+        <w:t xml:space="preserve">DBG_BOOT</w:t>
+      </w:r>
+      <w:r>
+        <w:t xml:space="preserve">: the</w:t>
+      </w:r>
+      <w:r>
+        <w:t xml:space="preserve"> </w:t>
+      </w:r>
+      <w:r>
+        <w:rPr>
+          <w:rStyle w:val="VerbatimChar"/>
+        </w:rPr>
+        <w:t xml:space="preserve">DBG_EN</w:t>
+      </w:r>
+      <w:r>
+        <w:t xml:space="preserve"> </w:t>
+      </w:r>
+      <w:r>
+        <w:t xml:space="preserve">pin, synchronised, for the boot ROM; a mask the host sets</w:t>
+      </w:r>
+      <w:r>
+        <w:t xml:space="preserve"> </w:t>
+      </w:r>
+      <w:r>
+        <w:t xml:space="preserve">over JTAG to let the ROM go on – 7.5.</w:t>
       </w:r>
     </w:p>
     <w:p>
@@ -1041,6 +1321,19 @@
         <w:jc w:val="left"/>
       </w:pPr>
       <w:r>
+        <w:t xml:space="preserve">Reset by power-on only, on a clock that is never gated – 7.1.</w:t>
+      </w:r>
+    </w:p>
+    <w:p>
+      <w:pPr>
+        <w:numPr>
+          <w:ilvl w:val="0"/>
+          <w:numId w:val="1001"/>
+        </w:numPr>
+        <w:pStyle w:val="Compact"/>
+        <w:jc w:val="left"/>
+      </w:pPr>
+      <w:r>
         <w:t xml:space="preserve">Generated by APB-CSR-Generator; one wait state per completed access – 7.4.</w:t>
       </w:r>
     </w:p>
@@ -1062,7 +1355,7 @@
       <w:r>
         <w:drawing>
           <wp:inline>
-            <wp:extent cx="5727700" cy="1822450"/>
+            <wp:extent cx="5727700" cy="2208153"/>
             <wp:effectExtent b="0" l="0" r="0" t="0"/>
             <wp:docPr descr="SYSCSR in the system: who writes and who reads each register" title="" id="25" name="Picture"/>
             <a:graphic>
@@ -1083,7 +1376,7 @@
                   <pic:spPr bwMode="auto">
                     <a:xfrm>
                       <a:off x="0" y="0"/>
-                      <a:ext cx="5727700" cy="1822450"/>
+                      <a:ext cx="5727700" cy="2208153"/>
                     </a:xfrm>
                     <a:prstGeom prst="rect">
                       <a:avLst/>
@@ -1164,7 +1457,61 @@
         <w:t xml:space="preserve"> </w:t>
       </w:r>
       <w:r>
-        <w:t xml:space="preserve">10); it adds no logic.</w:t>
+        <w:t xml:space="preserve">10); it adds no logic of its own. The</w:t>
+      </w:r>
+      <w:r>
+        <w:t xml:space="preserve"> </w:t>
+      </w:r>
+      <w:r>
+        <w:rPr>
+          <w:rStyle w:val="VerbatimChar"/>
+        </w:rPr>
+        <w:t xml:space="preserve">DBG_BOOT.dbg_en</w:t>
+      </w:r>
+      <w:r>
+        <w:t xml:space="preserve"> </w:t>
+      </w:r>
+      <w:r>
+        <w:t xml:space="preserve">bit, the only logic outside</w:t>
+      </w:r>
+      <w:r>
+        <w:t xml:space="preserve"> </w:t>
+      </w:r>
+      <w:r>
+        <w:t xml:space="preserve">the generated block, is the hand-written sub-module</w:t>
+      </w:r>
+      <w:r>
+        <w:t xml:space="preserve"> </w:t>
+      </w:r>
+      <w:r>
+        <w:rPr>
+          <w:rStyle w:val="VerbatimChar"/>
+        </w:rPr>
+        <w:t xml:space="preserve">m_qnsc_syscsr_dbg_en</w:t>
+      </w:r>
+      <w:r>
+        <w:t xml:space="preserve">: two</w:t>
+      </w:r>
+      <w:r>
+        <w:t xml:space="preserve"> </w:t>
+      </w:r>
+      <w:r>
+        <w:t xml:space="preserve">flip-flops on the</w:t>
+      </w:r>
+      <w:r>
+        <w:t xml:space="preserve"> </w:t>
+      </w:r>
+      <w:r>
+        <w:rPr>
+          <w:rStyle w:val="VerbatimChar"/>
+        </w:rPr>
+        <w:t xml:space="preserve">DBG_EN</w:t>
+      </w:r>
+      <w:r>
+        <w:t xml:space="preserve"> </w:t>
+      </w:r>
+      <w:r>
+        <w:t xml:space="preserve">pin and the mask (7.5).</w:t>
       </w:r>
     </w:p>
     <w:p>
@@ -1644,40 +1991,13 @@
         <w:rPr>
           <w:rStyle w:val="VerbatimChar"/>
         </w:rPr>
-        <w:t xml:space="preserve">w1c</w:t>
-      </w:r>
-      <w:r>
-        <w:t xml:space="preserve"> </w:t>
-      </w:r>
-      <w:r>
-        <w:t xml:space="preserve">field: an APB write clears the bits written 1; otherwise</w:t>
-      </w:r>
-      <w:r>
-        <w:t xml:space="preserve"> </w:t>
-      </w:r>
-      <w:r>
-        <w:rPr>
-          <w:rStyle w:val="VerbatimChar"/>
-        </w:rPr>
-        <w:t xml:space="preserve">i_hw_we</w:t>
-      </w:r>
-      <w:r>
-        <w:t xml:space="preserve"> </w:t>
-      </w:r>
-      <w:r>
-        <w:t xml:space="preserve">loads</w:t>
-      </w:r>
-      <w:r>
-        <w:t xml:space="preserve"> </w:t>
-      </w:r>
-      <w:r>
-        <w:rPr>
-          <w:rStyle w:val="VerbatimChar"/>
-        </w:rPr>
-        <w:t xml:space="preserve">i_hw_wdata</w:t>
-      </w:r>
-      <w:r>
-        <w:t xml:space="preserve">. The APB write wins when both occur in the same cycle – 7.2.</w:t>
+        <w:t xml:space="preserve">rw</w:t>
+      </w:r>
+      <w:r>
+        <w:t xml:space="preserve"> </w:t>
+      </w:r>
+      <w:r>
+        <w:t xml:space="preserve">field is a flip-flop loaded by an APB write; its value is an output.</w:t>
       </w:r>
     </w:p>
     <w:p>
@@ -1690,11 +2010,66 @@
         <w:jc w:val="left"/>
       </w:pPr>
       <w:r>
-        <w:t xml:space="preserve">An offset with no register reads 0 and ignores writes, without error.</w:t>
+        <w:t xml:space="preserve">A</w:t>
+      </w:r>
+      <w:r>
+        <w:t xml:space="preserve"> </w:t>
+      </w:r>
+      <w:r>
+        <w:rPr>
+          <w:rStyle w:val="VerbatimChar"/>
+        </w:rPr>
+        <w:t xml:space="preserve">w1c</w:t>
+      </w:r>
+      <w:r>
+        <w:t xml:space="preserve"> </w:t>
+      </w:r>
+      <w:r>
+        <w:t xml:space="preserve">field: an APB write clears the bits written 1; otherwise</w:t>
+      </w:r>
+      <w:r>
+        <w:t xml:space="preserve"> </w:t>
+      </w:r>
+      <w:r>
+        <w:rPr>
+          <w:rStyle w:val="VerbatimChar"/>
+        </w:rPr>
+        <w:t xml:space="preserve">i_hw_we</w:t>
+      </w:r>
+      <w:r>
+        <w:t xml:space="preserve"> </w:t>
+      </w:r>
+      <w:r>
+        <w:t xml:space="preserve">loads</w:t>
+      </w:r>
+      <w:r>
+        <w:t xml:space="preserve"> </w:t>
+      </w:r>
+      <w:r>
+        <w:rPr>
+          <w:rStyle w:val="VerbatimChar"/>
+        </w:rPr>
+        <w:t xml:space="preserve">i_hw_wdata</w:t>
+      </w:r>
+      <w:r>
+        <w:t xml:space="preserve">. The APB write wins when both occur in the same cycle – 7.2.</w:t>
       </w:r>
     </w:p>
     <w:p>
       <w:pPr>
+        <w:numPr>
+          <w:ilvl w:val="0"/>
+          <w:numId w:val="1002"/>
+        </w:numPr>
+        <w:pStyle w:val="Compact"/>
+        <w:jc w:val="left"/>
+      </w:pPr>
+      <w:r>
+        <w:t xml:space="preserve">An offset with no register reads 0 and ignores writes, without error.</w:t>
+      </w:r>
+    </w:p>
+    <w:p>
+      <w:pPr>
         <w:pStyle w:val="FirstParagraph"/>
       </w:pPr>
       <w:r>
@@ -1734,13 +2109,19 @@
         <w:t xml:space="preserve">chipidrev</w:t>
       </w:r>
       <w:r>
-        <w:t xml:space="preserve">; field</w:t>
-      </w:r>
-      <w:r>
-        <w:t xml:space="preserve"> </w:t>
-      </w:r>
-      <w:r>
-        <w:t xml:space="preserve">names are those of Tables 6-3 to 6-5. The workbook and the generated file are kept</w:t>
+        <w:t xml:space="preserve">,</w:t>
+      </w:r>
+      <w:r>
+        <w:t xml:space="preserve"> </w:t>
+      </w:r>
+      <w:r>
+        <w:rPr>
+          <w:rStyle w:val="VerbatimChar"/>
+        </w:rPr>
+        <w:t xml:space="preserve">dbgboot</w:t>
+      </w:r>
+      <w:r>
+        <w:t xml:space="preserve">; field names are those of Tables 6-3 to 6-6. The workbook and the generated file are kept</w:t>
       </w:r>
       <w:r>
         <w:t xml:space="preserve"> </w:t>
@@ -2859,6 +3240,86 @@
             </w:r>
             <w:r>
               <w:t xml:space="preserve">in reset. Reserved bits are not read</w:t>
+            </w:r>
+          </w:p>
+        </w:tc>
+      </w:tr>
+      <w:tr>
+        <w:tc>
+          <w:tcPr/>
+          <w:p>
+            <w:pPr>
+              <w:pStyle w:val="Compact"/>
+              <w:jc w:val="left"/>
+            </w:pPr>
+            <w:r>
+              <w:rPr>
+                <w:rStyle w:val="VerbatimChar"/>
+              </w:rPr>
+              <w:t xml:space="preserve">i_dbg_en</w:t>
+            </w:r>
+          </w:p>
+        </w:tc>
+        <w:tc>
+          <w:tcPr/>
+          <w:p>
+            <w:pPr>
+              <w:pStyle w:val="Compact"/>
+              <w:jc w:val="left"/>
+            </w:pPr>
+            <w:r>
+              <w:t xml:space="preserve">in</w:t>
+            </w:r>
+          </w:p>
+        </w:tc>
+        <w:tc>
+          <w:tcPr/>
+          <w:p>
+            <w:pPr>
+              <w:pStyle w:val="Compact"/>
+              <w:jc w:val="right"/>
+            </w:pPr>
+            <w:r>
+              <w:t xml:space="preserve">1</w:t>
+            </w:r>
+          </w:p>
+        </w:tc>
+        <w:tc>
+          <w:tcPr/>
+          <w:p>
+            <w:pPr>
+              <w:pStyle w:val="Compact"/>
+              <w:jc w:val="left"/>
+            </w:pPr>
+            <w:r>
+              <w:t xml:space="preserve">the</w:t>
+            </w:r>
+            <w:r>
+              <w:t xml:space="preserve"> </w:t>
+            </w:r>
+            <w:r>
+              <w:rPr>
+                <w:rStyle w:val="VerbatimChar"/>
+              </w:rPr>
+              <w:t xml:space="preserve">DBG_EN</w:t>
+            </w:r>
+            <w:r>
+              <w:t xml:space="preserve"> </w:t>
+            </w:r>
+            <w:r>
+              <w:t xml:space="preserve">pad</w:t>
+            </w:r>
+          </w:p>
+        </w:tc>
+        <w:tc>
+          <w:tcPr/>
+          <w:p>
+            <w:pPr>
+              <w:pStyle w:val="Compact"/>
+              <w:jc w:val="left"/>
+            </w:pPr>
+            <w:r>
+              <w:t xml:space="preserve">Asynchronous; synchronised inside, 7.5. 1 = debug boot</w:t>
             </w:r>
           </w:p>
         </w:tc>
@@ -3501,6 +3962,92 @@
               </w:rPr>
               <w:t xml:space="preserve">0x0C</w:t>
             </w:r>
+          </w:p>
+        </w:tc>
+        <w:tc>
+          <w:tcPr/>
+          <w:p>
+            <w:pPr>
+              <w:pStyle w:val="Compact"/>
+              <w:jc w:val="left"/>
+            </w:pPr>
+            <w:r>
+              <w:rPr>
+                <w:rStyle w:val="VerbatimChar"/>
+              </w:rPr>
+              <w:t xml:space="preserve">DBG_BOOT</w:t>
+            </w:r>
+          </w:p>
+        </w:tc>
+        <w:tc>
+          <w:tcPr/>
+          <w:p>
+            <w:pPr>
+              <w:pStyle w:val="Compact"/>
+              <w:jc w:val="left"/>
+            </w:pPr>
+            <w:r>
+              <w:t xml:space="preserve">RO, RW</w:t>
+            </w:r>
+          </w:p>
+        </w:tc>
+        <w:tc>
+          <w:tcPr/>
+          <w:p>
+            <w:pPr>
+              <w:pStyle w:val="Compact"/>
+              <w:jc w:val="left"/>
+            </w:pPr>
+            <w:r>
+              <w:rPr>
+                <w:rStyle w:val="VerbatimChar"/>
+              </w:rPr>
+              <w:t xml:space="preserve">0x0000_0000</w:t>
+            </w:r>
+          </w:p>
+        </w:tc>
+        <w:tc>
+          <w:tcPr/>
+          <w:p>
+            <w:pPr>
+              <w:pStyle w:val="Compact"/>
+              <w:jc w:val="left"/>
+            </w:pPr>
+            <w:r>
+              <w:t xml:space="preserve">Debug boot: the</w:t>
+            </w:r>
+            <w:r>
+              <w:t xml:space="preserve"> </w:t>
+            </w:r>
+            <w:r>
+              <w:rPr>
+                <w:rStyle w:val="VerbatimChar"/>
+              </w:rPr>
+              <w:t xml:space="preserve">DBG_EN</w:t>
+            </w:r>
+            <w:r>
+              <w:t xml:space="preserve"> </w:t>
+            </w:r>
+            <w:r>
+              <w:t xml:space="preserve">pin for the boot ROM, and its mask</w:t>
+            </w:r>
+          </w:p>
+        </w:tc>
+      </w:tr>
+      <w:tr>
+        <w:tc>
+          <w:tcPr/>
+          <w:p>
+            <w:pPr>
+              <w:pStyle w:val="Compact"/>
+              <w:jc w:val="left"/>
+            </w:pPr>
+            <w:r>
+              <w:rPr>
+                <w:rStyle w:val="VerbatimChar"/>
+              </w:rPr>
+              <w:t xml:space="preserve">0x10</w:t>
+            </w:r>
             <w:r>
               <w:t xml:space="preserve">–</w:t>
             </w:r>
@@ -3570,7 +4117,7 @@
       <w:r>
         <w:drawing>
           <wp:inline>
-            <wp:extent cx="5727700" cy="2379387"/>
+            <wp:extent cx="5727700" cy="3176604"/>
             <wp:effectExtent b="0" l="0" r="0" t="0"/>
             <wp:docPr descr="Register fields; shaded bits are reserved and read 0" title="" id="31" name="Picture"/>
             <a:graphic>
@@ -3591,7 +4138,7 @@
                   <pic:spPr bwMode="auto">
                     <a:xfrm>
                       <a:off x="0" y="0"/>
-                      <a:ext cx="5727700" cy="2379387"/>
+                      <a:ext cx="5727700" cy="3176604"/>
                     </a:xfrm>
                     <a:prstGeom prst="rect">
                       <a:avLst/>
@@ -5203,8 +5750,394 @@
         </w:tc>
       </w:tr>
     </w:tbl>
+    <w:p/>
+    <w:p>
+      <w:pPr>
+        <w:pStyle w:val="Tablecaption0"/>
+      </w:pPr>
+      <w:r>
+        <w:rPr>
+          <w:rStyle w:val="VerbatimChar"/>
+        </w:rPr>
+        <w:t xml:space="preserve">Table 6-6. DBG_BOOT</w:t>
+      </w:r>
+      <w:r>
+        <w:t xml:space="preserve"> </w:t>
+      </w:r>
+      <w:r>
+        <w:t xml:space="preserve">fields</w:t>
+      </w:r>
+    </w:p>
+    <w:tbl>
+      <w:tblPr>
+        <w:tblStyle w:val="TableGrid"/>
+        <w:tblW w:type="pct" w:w="5000"/>
+        <w:tblLook w:firstRow="1" w:lastRow="0" w:firstColumn="0" w:lastColumn="0" w:noHBand="0" w:noVBand="0" w:val="0020"/>
+        <w:jc w:val="start"/>
+        <w:tblCaption w:val="DBG_BOOT fields"/>
+      </w:tblPr>
+      <w:tblGrid>
+        <w:gridCol w:w="1584"/>
+        <w:gridCol w:w="1584"/>
+        <w:gridCol w:w="1584"/>
+        <w:gridCol w:w="1584"/>
+        <w:gridCol w:w="1584"/>
+      </w:tblGrid>
+      <w:tr>
+        <w:trPr>
+          <w:tblHeader w:val="true"/>
+        </w:trPr>
+        <w:tc>
+          <w:tcPr/>
+          <w:p>
+            <w:pPr>
+              <w:pStyle w:val="Compact"/>
+              <w:jc w:val="left"/>
+            </w:pPr>
+            <w:r>
+              <w:t xml:space="preserve">Bits</w:t>
+            </w:r>
+          </w:p>
+        </w:tc>
+        <w:tc>
+          <w:tcPr/>
+          <w:p>
+            <w:pPr>
+              <w:pStyle w:val="Compact"/>
+              <w:jc w:val="left"/>
+            </w:pPr>
+            <w:r>
+              <w:t xml:space="preserve">Field</w:t>
+            </w:r>
+          </w:p>
+        </w:tc>
+        <w:tc>
+          <w:tcPr/>
+          <w:p>
+            <w:pPr>
+              <w:pStyle w:val="Compact"/>
+              <w:jc w:val="left"/>
+            </w:pPr>
+            <w:r>
+              <w:t xml:space="preserve">Access</w:t>
+            </w:r>
+          </w:p>
+        </w:tc>
+        <w:tc>
+          <w:tcPr/>
+          <w:p>
+            <w:pPr>
+              <w:pStyle w:val="Compact"/>
+              <w:jc w:val="left"/>
+            </w:pPr>
+            <w:r>
+              <w:t xml:space="preserve">Reset</w:t>
+            </w:r>
+          </w:p>
+        </w:tc>
+        <w:tc>
+          <w:tcPr/>
+          <w:p>
+            <w:pPr>
+              <w:pStyle w:val="Compact"/>
+              <w:jc w:val="left"/>
+            </w:pPr>
+            <w:r>
+              <w:t xml:space="preserve">Description</w:t>
+            </w:r>
+          </w:p>
+        </w:tc>
+      </w:tr>
+      <w:tr>
+        <w:tc>
+          <w:tcPr/>
+          <w:p>
+            <w:pPr>
+              <w:pStyle w:val="Compact"/>
+              <w:jc w:val="left"/>
+            </w:pPr>
+            <w:r>
+              <w:t xml:space="preserve">0</w:t>
+            </w:r>
+          </w:p>
+        </w:tc>
+        <w:tc>
+          <w:tcPr/>
+          <w:p>
+            <w:pPr>
+              <w:pStyle w:val="Compact"/>
+              <w:jc w:val="left"/>
+            </w:pPr>
+            <w:r>
+              <w:rPr>
+                <w:rStyle w:val="VerbatimChar"/>
+              </w:rPr>
+              <w:t xml:space="preserve">dbg_en</w:t>
+            </w:r>
+          </w:p>
+        </w:tc>
+        <w:tc>
+          <w:tcPr/>
+          <w:p>
+            <w:pPr>
+              <w:pStyle w:val="Compact"/>
+              <w:jc w:val="left"/>
+            </w:pPr>
+            <w:r>
+              <w:t xml:space="preserve">RO</w:t>
+            </w:r>
+          </w:p>
+        </w:tc>
+        <w:tc>
+          <w:tcPr/>
+          <w:p>
+            <w:pPr>
+              <w:pStyle w:val="Compact"/>
+              <w:jc w:val="left"/>
+            </w:pPr>
+            <w:r>
+              <w:t xml:space="preserve">0</w:t>
+            </w:r>
+          </w:p>
+        </w:tc>
+        <w:tc>
+          <w:tcPr/>
+          <w:p>
+            <w:pPr>
+              <w:pStyle w:val="Compact"/>
+              <w:jc w:val="left"/>
+            </w:pPr>
+            <w:r>
+              <w:t xml:space="preserve">The</w:t>
+            </w:r>
+            <w:r>
+              <w:t xml:space="preserve"> </w:t>
+            </w:r>
+            <w:r>
+              <w:rPr>
+                <w:rStyle w:val="VerbatimChar"/>
+              </w:rPr>
+              <w:t xml:space="preserve">DBG_EN</w:t>
+            </w:r>
+            <w:r>
+              <w:t xml:space="preserve"> </w:t>
+            </w:r>
+            <w:r>
+              <w:t xml:space="preserve">pin through two flip-flops, 0 while</w:t>
+            </w:r>
+            <w:r>
+              <w:t xml:space="preserve"> </w:t>
+            </w:r>
+            <w:r>
+              <w:rPr>
+                <w:rStyle w:val="VerbatimChar"/>
+              </w:rPr>
+              <w:t xml:space="preserve">dbg_en_mask</w:t>
+            </w:r>
+            <w:r>
+              <w:t xml:space="preserve"> </w:t>
+            </w:r>
+            <w:r>
+              <w:t xml:space="preserve">= 1. The boot ROM waits while it is 1</w:t>
+            </w:r>
+          </w:p>
+        </w:tc>
+      </w:tr>
+      <w:tr>
+        <w:tc>
+          <w:tcPr/>
+          <w:p>
+            <w:pPr>
+              <w:pStyle w:val="Compact"/>
+              <w:jc w:val="left"/>
+            </w:pPr>
+            <w:r>
+              <w:t xml:space="preserve">1</w:t>
+            </w:r>
+          </w:p>
+        </w:tc>
+        <w:tc>
+          <w:tcPr/>
+          <w:p>
+            <w:pPr>
+              <w:pStyle w:val="Compact"/>
+              <w:jc w:val="left"/>
+            </w:pPr>
+            <w:r>
+              <w:rPr>
+                <w:rStyle w:val="VerbatimChar"/>
+              </w:rPr>
+              <w:t xml:space="preserve">dbg_en_mask</w:t>
+            </w:r>
+          </w:p>
+        </w:tc>
+        <w:tc>
+          <w:tcPr/>
+          <w:p>
+            <w:pPr>
+              <w:pStyle w:val="Compact"/>
+              <w:jc w:val="left"/>
+            </w:pPr>
+            <w:r>
+              <w:t xml:space="preserve">RW</w:t>
+            </w:r>
+          </w:p>
+        </w:tc>
+        <w:tc>
+          <w:tcPr/>
+          <w:p>
+            <w:pPr>
+              <w:pStyle w:val="Compact"/>
+              <w:jc w:val="left"/>
+            </w:pPr>
+            <w:r>
+              <w:t xml:space="preserve">0</w:t>
+            </w:r>
+          </w:p>
+        </w:tc>
+        <w:tc>
+          <w:tcPr/>
+          <w:p>
+            <w:pPr>
+              <w:pStyle w:val="Compact"/>
+              <w:jc w:val="left"/>
+            </w:pPr>
+            <w:r>
+              <w:t xml:space="preserve">Written 1 by the host over JTAG to end the boot ROM’s wait. It can only force</w:t>
+            </w:r>
+            <w:r>
+              <w:t xml:space="preserve"> </w:t>
+            </w:r>
+            <w:r>
+              <w:rPr>
+                <w:rStyle w:val="VerbatimChar"/>
+              </w:rPr>
+              <w:t xml:space="preserve">dbg_en</w:t>
+            </w:r>
+            <w:r>
+              <w:t xml:space="preserve"> </w:t>
+            </w:r>
+            <w:r>
+              <w:t xml:space="preserve">to 0</w:t>
+            </w:r>
+          </w:p>
+        </w:tc>
+      </w:tr>
+      <w:tr>
+        <w:tc>
+          <w:tcPr/>
+          <w:p>
+            <w:pPr>
+              <w:pStyle w:val="Compact"/>
+              <w:jc w:val="left"/>
+            </w:pPr>
+            <w:r>
+              <w:t xml:space="preserve">31:2</w:t>
+            </w:r>
+          </w:p>
+        </w:tc>
+        <w:tc>
+          <w:tcPr/>
+          <w:p>
+            <w:pPr>
+              <w:pStyle w:val="Compact"/>
+              <w:jc w:val="left"/>
+            </w:pPr>
+            <w:r>
+              <w:t xml:space="preserve">–</w:t>
+            </w:r>
+          </w:p>
+        </w:tc>
+        <w:tc>
+          <w:tcPr/>
+          <w:p>
+            <w:pPr>
+              <w:pStyle w:val="Compact"/>
+              <w:jc w:val="left"/>
+            </w:pPr>
+            <w:r>
+              <w:t xml:space="preserve">RSVD</w:t>
+            </w:r>
+          </w:p>
+        </w:tc>
+        <w:tc>
+          <w:tcPr/>
+          <w:p>
+            <w:pPr>
+              <w:pStyle w:val="Compact"/>
+              <w:jc w:val="left"/>
+            </w:pPr>
+            <w:r>
+              <w:t xml:space="preserve">0</w:t>
+            </w:r>
+          </w:p>
+        </w:tc>
+        <w:tc>
+          <w:tcPr/>
+          <w:p>
+            <w:pPr>
+              <w:pStyle w:val="Compact"/>
+              <w:jc w:val="left"/>
+            </w:pPr>
+            <w:r>
+              <w:t xml:space="preserve">–</w:t>
+            </w:r>
+          </w:p>
+        </w:tc>
+      </w:tr>
+    </w:tbl>
+    <w:p>
+      <w:pPr>
+        <w:pStyle w:val="BodyText"/>
+      </w:pPr>
+      <w:r>
+        <w:t xml:space="preserve">The mentor’s drawing of 12/10 names these</w:t>
+      </w:r>
+      <w:r>
+        <w:t xml:space="preserve"> </w:t>
+      </w:r>
+      <w:r>
+        <w:rPr>
+          <w:rStyle w:val="VerbatimChar"/>
+        </w:rPr>
+        <w:t xml:space="preserve">SYSCSR.DEBUG_EN</w:t>
+      </w:r>
+      <w:r>
+        <w:t xml:space="preserve"> </w:t>
+      </w:r>
+      <w:r>
+        <w:t xml:space="preserve">and</w:t>
+      </w:r>
+      <w:r>
+        <w:t xml:space="preserve"> </w:t>
+      </w:r>
+      <w:r>
+        <w:rPr>
+          <w:rStyle w:val="VerbatimChar"/>
+        </w:rPr>
+        <w:t xml:space="preserve">SYSCSR.DEBUG_EN_MASK</w:t>
+      </w:r>
+      <w:r>
+        <w:t xml:space="preserve">; the Naming Rule writes</w:t>
+      </w:r>
+      <w:r>
+        <w:t xml:space="preserve"> </w:t>
+      </w:r>
+      <w:r>
+        <w:rPr>
+          <w:rStyle w:val="VerbatimChar"/>
+        </w:rPr>
+        <w:t xml:space="preserve">dbg</w:t>
+      </w:r>
+      <w:r>
+        <w:t xml:space="preserve"> </w:t>
+      </w:r>
+      <w:r>
+        <w:t xml:space="preserve">(rule 1.5).</w:t>
+      </w:r>
+    </w:p>
     <w:bookmarkEnd w:id="33"/>
-    <w:bookmarkStart w:id="42" w:name="functional-behaviour"/>
+    <w:bookmarkStart w:id="46" w:name="functional-behaviour"/>
     <w:p>
       <w:pPr>
         <w:pStyle w:val="Heading1"/>
@@ -5762,7 +6695,7 @@
         <w:jc w:val="left"/>
       </w:pPr>
       <w:r>
-        <w:t xml:space="preserve">A bit is 1 while its domain is in reset: during a chip reset, for</w:t>
+        <w:t xml:space="preserve">A bit is 1 while its domain is in reset: during a chip reset, and for</w:t>
       </w:r>
       <w:r>
         <w:t xml:space="preserve"> </w:t>
@@ -5777,28 +6710,25 @@
         <w:t xml:space="preserve"> </w:t>
       </w:r>
       <w:r>
-        <w:t xml:space="preserve">until</w:t>
-      </w:r>
-      <w:r>
-        <w:t xml:space="preserve"> </w:t>
-      </w:r>
-      <w:r>
-        <w:t xml:space="preserve">its clock first runs, and for the CPU while</w:t>
-      </w:r>
-      <w:r>
-        <w:t xml:space="preserve"> </w:t>
+        <w:t xml:space="preserve">until its clock first runs. Debug boot holds no domain in reset: the CPU runs the</w:t>
+      </w:r>
+      <w:r>
+        <w:t xml:space="preserve"> </w:t>
+      </w:r>
+      <w:r>
+        <w:t xml:space="preserve">boot ROM while it waits (</w:t>
       </w:r>
       <w:r>
         <w:rPr>
           <w:rStyle w:val="VerbatimChar"/>
         </w:rPr>
-        <w:t xml:space="preserve">SYSDBG</w:t>
-      </w:r>
-      <w:r>
-        <w:t xml:space="preserve"> </w:t>
-      </w:r>
-      <w:r>
-        <w:t xml:space="preserve">holds it.</w:t>
+        <w:t xml:space="preserve">QNSC_BOOT_SPEC</w:t>
+      </w:r>
+      <w:r>
+        <w:t xml:space="preserve"> </w:t>
+      </w:r>
+      <w:r>
+        <w:t xml:space="preserve">7.5).</w:t>
       </w:r>
     </w:p>
     <w:p>
@@ -5875,7 +6805,7 @@
               <w:jc w:val="left"/>
             </w:pPr>
             <w:r>
-              <w:t xml:space="preserve">After any reset, normal boot</w:t>
+              <w:t xml:space="preserve">After any reset, normal or debug boot</w:t>
             </w:r>
           </w:p>
         </w:tc>
@@ -5912,83 +6842,6 @@
             </w:r>
             <w:r>
               <w:t xml:space="preserve">is gated after reset, so still in reset</w:t>
-            </w:r>
-          </w:p>
-        </w:tc>
-      </w:tr>
-      <w:tr>
-        <w:tc>
-          <w:tcPr/>
-          <w:p>
-            <w:pPr>
-              <w:pStyle w:val="Compact"/>
-              <w:jc w:val="left"/>
-            </w:pPr>
-            <w:r>
-              <w:t xml:space="preserve">Debug boot, CPU held, read by</w:t>
-            </w:r>
-            <w:r>
-              <w:t xml:space="preserve"> </w:t>
-            </w:r>
-            <w:r>
-              <w:rPr>
-                <w:rStyle w:val="VerbatimChar"/>
-              </w:rPr>
-              <w:t xml:space="preserve">SYSDBG</w:t>
-            </w:r>
-          </w:p>
-        </w:tc>
-        <w:tc>
-          <w:tcPr/>
-          <w:p>
-            <w:pPr>
-              <w:pStyle w:val="Compact"/>
-              <w:jc w:val="left"/>
-            </w:pPr>
-            <w:r>
-              <w:rPr>
-                <w:rStyle w:val="VerbatimChar"/>
-              </w:rPr>
-              <w:t xml:space="preserve">0x8000_0010</w:t>
-            </w:r>
-          </w:p>
-        </w:tc>
-        <w:tc>
-          <w:tcPr/>
-          <w:p>
-            <w:pPr>
-              <w:pStyle w:val="Compact"/>
-              <w:jc w:val="left"/>
-            </w:pPr>
-            <w:r>
-              <w:t xml:space="preserve">also</w:t>
-            </w:r>
-            <w:r>
-              <w:t xml:space="preserve"> </w:t>
-            </w:r>
-            <w:r>
-              <w:rPr>
-                <w:rStyle w:val="VerbatimChar"/>
-              </w:rPr>
-              <w:t xml:space="preserve">stat_cpu</w:t>
-            </w:r>
-            <w:r>
-              <w:t xml:space="preserve">:</w:t>
-            </w:r>
-            <w:r>
-              <w:t xml:space="preserve"> </w:t>
-            </w:r>
-            <w:r>
-              <w:rPr>
-                <w:rStyle w:val="VerbatimChar"/>
-              </w:rPr>
-              <w:t xml:space="preserve">o_dbg_cpu_hold</w:t>
-            </w:r>
-            <w:r>
-              <w:t xml:space="preserve"> </w:t>
-            </w:r>
-            <w:r>
-              <w:t xml:space="preserve">= 1</w:t>
             </w:r>
           </w:p>
         </w:tc>
@@ -6094,7 +6947,13 @@
         <w:t xml:space="preserve">SYSDBG</w:t>
       </w:r>
       <w:r>
-        <w:t xml:space="preserve">.</w:t>
+        <w:t xml:space="preserve">, which</w:t>
+      </w:r>
+      <w:r>
+        <w:t xml:space="preserve"> </w:t>
+      </w:r>
+      <w:r>
+        <w:t xml:space="preserve">can read it during a chip reset.</w:t>
       </w:r>
     </w:p>
     <w:bookmarkEnd w:id="39"/>
@@ -6565,13 +7424,82 @@
       </w:r>
     </w:p>
     <w:bookmarkEnd w:id="40"/>
-    <w:bookmarkStart w:id="41" w:name="firmware-use"/>
+    <w:bookmarkStart w:id="44" w:name="debug-boot-status"/>
     <w:p>
       <w:pPr>
         <w:pStyle w:val="Heading2"/>
       </w:pPr>
       <w:r>
-        <w:t xml:space="preserve">7.5 Firmware use</w:t>
+        <w:t xml:space="preserve">7.5 Debug boot status</w:t>
+      </w:r>
+    </w:p>
+    <w:p>
+      <w:pPr>
+        <w:pStyle w:val="CaptionedFigure"/>
+        <w:jc w:val="left"/>
+      </w:pPr>
+      <w:r>
+        <w:drawing>
+          <wp:inline>
+            <wp:extent cx="5029200" cy="1699222"/>
+            <wp:effectExtent b="0" l="0" r="0" t="0"/>
+            <wp:docPr descr="DBG_BOOT.dbg_en: the DBG_EN pin through two flip-flops, forced to 0 by the mask" title="" id="42" name="Picture"/>
+            <a:graphic>
+              <a:graphicData uri="http://schemas.openxmlformats.org/drawingml/2006/picture">
+                <pic:pic>
+                  <pic:nvPicPr>
+                    <pic:cNvPr descr="../figures/img/fig_syscsr_dbg_en.png" id="43" name="Picture"/>
+                    <pic:cNvPicPr>
+                      <a:picLocks noChangeArrowheads="1" noChangeAspect="1"/>
+                    </pic:cNvPicPr>
+                  </pic:nvPicPr>
+                  <pic:blipFill>
+                    <a:blip r:embed="rId41"/>
+                    <a:stretch>
+                      <a:fillRect/>
+                    </a:stretch>
+                  </pic:blipFill>
+                  <pic:spPr bwMode="auto">
+                    <a:xfrm>
+                      <a:off x="0" y="0"/>
+                      <a:ext cx="5029200" cy="1699222"/>
+                    </a:xfrm>
+                    <a:prstGeom prst="rect">
+                      <a:avLst/>
+                    </a:prstGeom>
+                    <a:noFill/>
+                    <a:ln w="9525">
+                      <a:noFill/>
+                      <a:headEnd/>
+                      <a:tailEnd/>
+                    </a:ln>
+                  </pic:spPr>
+                </pic:pic>
+              </a:graphicData>
+            </a:graphic>
+          </wp:inline>
+        </w:drawing>
+      </w:r>
+    </w:p>
+    <w:p>
+      <w:pPr>
+        <w:pStyle w:val="ImageCaption"/>
+        <w:jc w:val="left"/>
+      </w:pPr>
+      <w:r>
+        <w:t xml:space="preserve">Figure 7-2. DBG_BOOT.dbg_en: the DBG_EN pin through two flip-flops, forced to 0 by the mask</w:t>
+      </w:r>
+    </w:p>
+    <w:p>
+      <w:pPr>
+        <w:pStyle w:val="SourceCode"/>
+        <w:jc w:val="left"/>
+      </w:pPr>
+      <w:r>
+        <w:rPr>
+          <w:rStyle w:val="VerbatimChar"/>
+        </w:rPr>
+        <w:t xml:space="preserve">dbg_en = dbg_en_mask ? 0 : DBG_EN pin delayed by two flip-flops</w:t>
       </w:r>
     </w:p>
     <w:p>
@@ -6584,7 +7512,7 @@
         <w:jc w:val="left"/>
       </w:pPr>
       <w:r>
-        <w:t xml:space="preserve">At start-up, read</w:t>
+        <w:t xml:space="preserve">The</w:t>
       </w:r>
       <w:r>
         <w:t xml:space="preserve"> </w:t>
@@ -6593,16 +7521,76 @@
         <w:rPr>
           <w:rStyle w:val="VerbatimChar"/>
         </w:rPr>
-        <w:t xml:space="preserve">RESET_CAUSE</w:t>
-      </w:r>
-      <w:r>
-        <w:t xml:space="preserve">, keep the value, and write it back to clear the</w:t>
-      </w:r>
-      <w:r>
-        <w:t xml:space="preserve"> </w:t>
-      </w:r>
-      <w:r>
-        <w:t xml:space="preserve">bits that were set.</w:t>
+        <w:t xml:space="preserve">DBG_EN</w:t>
+      </w:r>
+      <w:r>
+        <w:t xml:space="preserve"> </w:t>
+      </w:r>
+      <w:r>
+        <w:t xml:space="preserve">pin is set on the board and is asynchronous to</w:t>
+      </w:r>
+      <w:r>
+        <w:t xml:space="preserve"> </w:t>
+      </w:r>
+      <w:r>
+        <w:rPr>
+          <w:rStyle w:val="VerbatimChar"/>
+        </w:rPr>
+        <w:t xml:space="preserve">i_clk_cpu</w:t>
+      </w:r>
+      <w:r>
+        <w:t xml:space="preserve">, so it</w:t>
+      </w:r>
+      <w:r>
+        <w:t xml:space="preserve"> </w:t>
+      </w:r>
+      <w:r>
+        <w:t xml:space="preserve">passes two flip-flops, reset to 0 by</w:t>
+      </w:r>
+      <w:r>
+        <w:t xml:space="preserve"> </w:t>
+      </w:r>
+      <w:r>
+        <w:rPr>
+          <w:rStyle w:val="VerbatimChar"/>
+        </w:rPr>
+        <w:t xml:space="preserve">i_rst_n_por</w:t>
+      </w:r>
+      <w:r>
+        <w:t xml:space="preserve">, before anything reads it.</w:t>
+      </w:r>
+      <w:r>
+        <w:t xml:space="preserve"> </w:t>
+      </w:r>
+      <w:r>
+        <w:rPr>
+          <w:rStyle w:val="VerbatimChar"/>
+        </w:rPr>
+        <w:t xml:space="preserve">dbg_en</w:t>
+      </w:r>
+      <w:r>
+        <w:t xml:space="preserve"> </w:t>
+      </w:r>
+      <w:r>
+        <w:t xml:space="preserve">follows the pin two clock edges later, rising and falling: it is not</w:t>
+      </w:r>
+      <w:r>
+        <w:t xml:space="preserve"> </w:t>
+      </w:r>
+      <w:r>
+        <w:t xml:space="preserve">latched, so the pin is read whenever the ROM reads</w:t>
+      </w:r>
+      <w:r>
+        <w:t xml:space="preserve"> </w:t>
+      </w:r>
+      <w:r>
+        <w:rPr>
+          <w:rStyle w:val="VerbatimChar"/>
+        </w:rPr>
+        <w:t xml:space="preserve">DBG_BOOT</w:t>
+      </w:r>
+      <w:r>
+        <w:t xml:space="preserve">.</w:t>
       </w:r>
     </w:p>
     <w:p>
@@ -6615,22 +7603,16 @@
         <w:jc w:val="left"/>
       </w:pPr>
       <w:r>
-        <w:t xml:space="preserve">Read</w:t>
-      </w:r>
-      <w:r>
-        <w:t xml:space="preserve"> </w:t>
-      </w:r>
-      <w:r>
         <w:rPr>
           <w:rStyle w:val="VerbatimChar"/>
         </w:rPr>
-        <w:t xml:space="preserve">CHIP_ID_REV</w:t>
-      </w:r>
-      <w:r>
-        <w:t xml:space="preserve"> </w:t>
-      </w:r>
-      <w:r>
-        <w:t xml:space="preserve">to check the program, or the host through</w:t>
+        <w:t xml:space="preserve">dbg_en_mask</w:t>
+      </w:r>
+      <w:r>
+        <w:t xml:space="preserve"> </w:t>
+      </w:r>
+      <w:r>
+        <w:t xml:space="preserve">is the select of a mux whose other input is 0. Writing it 1 forces</w:t>
       </w:r>
       <w:r>
         <w:t xml:space="preserve"> </w:t>
@@ -6639,25 +7621,364 @@
         <w:rPr>
           <w:rStyle w:val="VerbatimChar"/>
         </w:rPr>
-        <w:t xml:space="preserve">SYSDBG</w:t>
-      </w:r>
-      <w:r>
-        <w:t xml:space="preserve">, is on a QSOC.</w:t>
-      </w:r>
-    </w:p>
-    <w:bookmarkEnd w:id="41"/>
-    <w:bookmarkEnd w:id="42"/>
-    <w:bookmarkStart w:id="43" w:name="instances"/>
-    <w:p>
-      <w:pPr>
-        <w:pStyle w:val="Heading1"/>
-      </w:pPr>
-      <w:r>
-        <w:t xml:space="preserve">8. Instances</w:t>
+        <w:t xml:space="preserve">dbg_en</w:t>
+      </w:r>
+      <w:r>
+        <w:t xml:space="preserve"> </w:t>
+      </w:r>
+      <w:r>
+        <w:t xml:space="preserve">to 0 whatever the pin; writing it 0 shows the pin again. No write can set</w:t>
+      </w:r>
+      <w:r>
+        <w:t xml:space="preserve"> </w:t>
+      </w:r>
+      <w:r>
+        <w:rPr>
+          <w:rStyle w:val="VerbatimChar"/>
+        </w:rPr>
+        <w:t xml:space="preserve">dbg_en</w:t>
+      </w:r>
+      <w:r>
+        <w:t xml:space="preserve"> </w:t>
+      </w:r>
+      <w:r>
+        <w:t xml:space="preserve">to 1.</w:t>
       </w:r>
     </w:p>
     <w:p>
       <w:pPr>
+        <w:numPr>
+          <w:ilvl w:val="0"/>
+          <w:numId w:val="1006"/>
+        </w:numPr>
+        <w:pStyle w:val="Compact"/>
+        <w:jc w:val="left"/>
+      </w:pPr>
+      <w:r>
+        <w:t xml:space="preserve">The boot ROM reads</w:t>
+      </w:r>
+      <w:r>
+        <w:t xml:space="preserve"> </w:t>
+      </w:r>
+      <w:r>
+        <w:rPr>
+          <w:rStyle w:val="VerbatimChar"/>
+        </w:rPr>
+        <w:t xml:space="preserve">DBG_BOOT</w:t>
+      </w:r>
+      <w:r>
+        <w:t xml:space="preserve"> </w:t>
+      </w:r>
+      <w:r>
+        <w:t xml:space="preserve">after it has received the frame and polls it while</w:t>
+      </w:r>
+      <w:r>
+        <w:t xml:space="preserve"> </w:t>
+      </w:r>
+      <w:r>
+        <w:rPr>
+          <w:rStyle w:val="VerbatimChar"/>
+        </w:rPr>
+        <w:t xml:space="preserve">dbg_en</w:t>
+      </w:r>
+      <w:r>
+        <w:t xml:space="preserve"> </w:t>
+      </w:r>
+      <w:r>
+        <w:t xml:space="preserve">= 1 (</w:t>
+      </w:r>
+      <w:r>
+        <w:rPr>
+          <w:rStyle w:val="VerbatimChar"/>
+        </w:rPr>
+        <w:t xml:space="preserve">QNSC_BOOT_SPEC</w:t>
+      </w:r>
+      <w:r>
+        <w:t xml:space="preserve"> </w:t>
+      </w:r>
+      <w:r>
+        <w:t xml:space="preserve">7.5). The host ends the wait by writing</w:t>
+      </w:r>
+      <w:r>
+        <w:t xml:space="preserve"> </w:t>
+      </w:r>
+      <w:r>
+        <w:rPr>
+          <w:rStyle w:val="VerbatimChar"/>
+        </w:rPr>
+        <w:t xml:space="preserve">DBG_BOOT</w:t>
+      </w:r>
+      <w:r>
+        <w:t xml:space="preserve"> </w:t>
+      </w:r>
+      <w:r>
+        <w:t xml:space="preserve">=</w:t>
+      </w:r>
+      <w:r>
+        <w:t xml:space="preserve"> </w:t>
+      </w:r>
+      <w:r>
+        <w:rPr>
+          <w:rStyle w:val="VerbatimChar"/>
+        </w:rPr>
+        <w:t xml:space="preserve">0x2</w:t>
+      </w:r>
+      <w:r>
+        <w:t xml:space="preserve"> </w:t>
+      </w:r>
+      <w:r>
+        <w:t xml:space="preserve">through the</w:t>
+      </w:r>
+      <w:r>
+        <w:t xml:space="preserve"> </w:t>
+      </w:r>
+      <w:r>
+        <w:rPr>
+          <w:rStyle w:val="VerbatimChar"/>
+        </w:rPr>
+        <w:t xml:space="preserve">SYSDBG</w:t>
+      </w:r>
+      <w:r>
+        <w:t xml:space="preserve"> </w:t>
+      </w:r>
+      <w:r>
+        <w:t xml:space="preserve">bus master:</w:t>
+      </w:r>
+      <w:r>
+        <w:t xml:space="preserve"> </w:t>
+      </w:r>
+      <w:r>
+        <w:rPr>
+          <w:rStyle w:val="VerbatimChar"/>
+        </w:rPr>
+        <w:t xml:space="preserve">AXI_S0</w:t>
+      </w:r>
+      <w:r>
+        <w:t xml:space="preserve">,</w:t>
+      </w:r>
+      <w:r>
+        <w:t xml:space="preserve"> </w:t>
+      </w:r>
+      <w:r>
+        <w:rPr>
+          <w:rStyle w:val="VerbatimChar"/>
+        </w:rPr>
+        <w:t xml:space="preserve">S_BUS</w:t>
+      </w:r>
+      <w:r>
+        <w:t xml:space="preserve">,</w:t>
+      </w:r>
+      <w:r>
+        <w:t xml:space="preserve"> </w:t>
+      </w:r>
+      <w:r>
+        <w:rPr>
+          <w:rStyle w:val="VerbatimChar"/>
+        </w:rPr>
+        <w:t xml:space="preserve">P_BUS</w:t>
+      </w:r>
+      <w:r>
+        <w:t xml:space="preserve">.</w:t>
+      </w:r>
+    </w:p>
+    <w:p>
+      <w:pPr>
+        <w:numPr>
+          <w:ilvl w:val="0"/>
+          <w:numId w:val="1006"/>
+        </w:numPr>
+        <w:pStyle w:val="Compact"/>
+        <w:jc w:val="left"/>
+      </w:pPr>
+      <w:r>
+        <w:t xml:space="preserve">Like every</w:t>
+      </w:r>
+      <w:r>
+        <w:t xml:space="preserve"> </w:t>
+      </w:r>
+      <w:r>
+        <w:rPr>
+          <w:rStyle w:val="VerbatimChar"/>
+        </w:rPr>
+        <w:t xml:space="preserve">SYSCSR</w:t>
+      </w:r>
+      <w:r>
+        <w:t xml:space="preserve"> </w:t>
+      </w:r>
+      <w:r>
+        <w:t xml:space="preserve">flip-flop,</w:t>
+      </w:r>
+      <w:r>
+        <w:t xml:space="preserve"> </w:t>
+      </w:r>
+      <w:r>
+        <w:rPr>
+          <w:rStyle w:val="VerbatimChar"/>
+        </w:rPr>
+        <w:t xml:space="preserve">dbg_en_mask</w:t>
+      </w:r>
+      <w:r>
+        <w:t xml:space="preserve"> </w:t>
+      </w:r>
+      <w:r>
+        <w:t xml:space="preserve">is reset by power-on only: after a</w:t>
+      </w:r>
+      <w:r>
+        <w:t xml:space="preserve"> </w:t>
+      </w:r>
+      <w:r>
+        <w:t xml:space="preserve">watchdog or software reset it keeps the value the host wrote, so the boot ROM</w:t>
+      </w:r>
+      <w:r>
+        <w:t xml:space="preserve"> </w:t>
+      </w:r>
+      <w:r>
+        <w:t xml:space="preserve">waits again only after a power-on. Confirmed by the mentor on 12/10.</w:t>
+      </w:r>
+    </w:p>
+    <w:p>
+      <w:pPr>
+        <w:numPr>
+          <w:ilvl w:val="0"/>
+          <w:numId w:val="1006"/>
+        </w:numPr>
+        <w:pStyle w:val="Compact"/>
+        <w:jc w:val="left"/>
+      </w:pPr>
+      <w:r>
+        <w:t xml:space="preserve">The two flip-flops are behavioural RTL.</w:t>
+      </w:r>
+      <w:r>
+        <w:t xml:space="preserve"> </w:t>
+      </w:r>
+      <w:r>
+        <w:rPr>
+          <w:rStyle w:val="VerbatimChar"/>
+        </w:rPr>
+        <w:t xml:space="preserve">design/common/tech</w:t>
+      </w:r>
+      <w:r>
+        <w:t xml:space="preserve"> </w:t>
+      </w:r>
+      <w:r>
+        <w:t xml:space="preserve">has no synchroniser</w:t>
+      </w:r>
+      <w:r>
+        <w:t xml:space="preserve"> </w:t>
+      </w:r>
+      <w:r>
+        <w:t xml:space="preserve">cell yet; when one is added,</w:t>
+      </w:r>
+      <w:r>
+        <w:t xml:space="preserve"> </w:t>
+      </w:r>
+      <w:r>
+        <w:rPr>
+          <w:rStyle w:val="VerbatimChar"/>
+        </w:rPr>
+        <w:t xml:space="preserve">m_qnsc_syscsr_dbg_en</w:t>
+      </w:r>
+      <w:r>
+        <w:t xml:space="preserve"> </w:t>
+      </w:r>
+      <w:r>
+        <w:t xml:space="preserve">instantiates it.</w:t>
+      </w:r>
+    </w:p>
+    <w:bookmarkEnd w:id="44"/>
+    <w:bookmarkStart w:id="45" w:name="firmware-use"/>
+    <w:p>
+      <w:pPr>
+        <w:pStyle w:val="Heading2"/>
+      </w:pPr>
+      <w:r>
+        <w:t xml:space="preserve">7.6 Firmware use</w:t>
+      </w:r>
+    </w:p>
+    <w:p>
+      <w:pPr>
+        <w:numPr>
+          <w:ilvl w:val="0"/>
+          <w:numId w:val="1007"/>
+        </w:numPr>
+        <w:pStyle w:val="Compact"/>
+        <w:jc w:val="left"/>
+      </w:pPr>
+      <w:r>
+        <w:t xml:space="preserve">At start-up, read</w:t>
+      </w:r>
+      <w:r>
+        <w:t xml:space="preserve"> </w:t>
+      </w:r>
+      <w:r>
+        <w:rPr>
+          <w:rStyle w:val="VerbatimChar"/>
+        </w:rPr>
+        <w:t xml:space="preserve">RESET_CAUSE</w:t>
+      </w:r>
+      <w:r>
+        <w:t xml:space="preserve">, keep the value, and write it back to clear the</w:t>
+      </w:r>
+      <w:r>
+        <w:t xml:space="preserve"> </w:t>
+      </w:r>
+      <w:r>
+        <w:t xml:space="preserve">bits that were set.</w:t>
+      </w:r>
+    </w:p>
+    <w:p>
+      <w:pPr>
+        <w:numPr>
+          <w:ilvl w:val="0"/>
+          <w:numId w:val="1007"/>
+        </w:numPr>
+        <w:pStyle w:val="Compact"/>
+        <w:jc w:val="left"/>
+      </w:pPr>
+      <w:r>
+        <w:t xml:space="preserve">Read</w:t>
+      </w:r>
+      <w:r>
+        <w:t xml:space="preserve"> </w:t>
+      </w:r>
+      <w:r>
+        <w:rPr>
+          <w:rStyle w:val="VerbatimChar"/>
+        </w:rPr>
+        <w:t xml:space="preserve">CHIP_ID_REV</w:t>
+      </w:r>
+      <w:r>
+        <w:t xml:space="preserve"> </w:t>
+      </w:r>
+      <w:r>
+        <w:t xml:space="preserve">to check the program, or the host through</w:t>
+      </w:r>
+      <w:r>
+        <w:t xml:space="preserve"> </w:t>
+      </w:r>
+      <w:r>
+        <w:rPr>
+          <w:rStyle w:val="VerbatimChar"/>
+        </w:rPr>
+        <w:t xml:space="preserve">SYSDBG</w:t>
+      </w:r>
+      <w:r>
+        <w:t xml:space="preserve">, is on a QSOC.</w:t>
+      </w:r>
+    </w:p>
+    <w:bookmarkEnd w:id="45"/>
+    <w:bookmarkEnd w:id="46"/>
+    <w:bookmarkStart w:id="47" w:name="instances"/>
+    <w:p>
+      <w:pPr>
+        <w:pStyle w:val="Heading1"/>
+      </w:pPr>
+      <w:r>
+        <w:t xml:space="preserve">8. Instances</w:t>
+      </w:r>
+    </w:p>
+    <w:p>
+      <w:pPr>
         <w:pStyle w:val="FirstParagraph"/>
       </w:pPr>
       <w:r>
@@ -6700,11 +8021,26 @@
         <w:t xml:space="preserve">m_qnsc_syscsr_csr</w:t>
       </w:r>
       <w:r>
+        <w:t xml:space="preserve"> </w:t>
+      </w:r>
+      <w:r>
+        <w:t xml:space="preserve">and one</w:t>
+      </w:r>
+      <w:r>
+        <w:t xml:space="preserve"> </w:t>
+      </w:r>
+      <w:r>
+        <w:rPr>
+          <w:rStyle w:val="VerbatimChar"/>
+        </w:rPr>
+        <w:t xml:space="preserve">m_qnsc_syscsr_dbg_en</w:t>
+      </w:r>
+      <w:r>
         <w:t xml:space="preserve">.</w:t>
       </w:r>
     </w:p>
-    <w:bookmarkEnd w:id="43"/>
-    <w:bookmarkStart w:id="44" w:name="X31074a9102d88bba972e4f71edc3e97f3cd819b"/>
+    <w:bookmarkEnd w:id="47"/>
+    <w:bookmarkStart w:id="48" w:name="X31074a9102d88bba972e4f71edc3e97f3cd819b"/>
     <w:p>
       <w:pPr>
         <w:pStyle w:val="Heading1"/>
@@ -6909,9 +8245,47 @@
           </w:p>
         </w:tc>
       </w:tr>
+      <w:tr>
+        <w:tc>
+          <w:tcPr/>
+          <w:p>
+            <w:pPr>
+              <w:pStyle w:val="Compact"/>
+              <w:jc w:val="left"/>
+            </w:pPr>
+            <w:r>
+              <w:t xml:space="preserve">Holding the CPU in debug boot</w:t>
+            </w:r>
+          </w:p>
+        </w:tc>
+        <w:tc>
+          <w:tcPr/>
+          <w:p>
+            <w:pPr>
+              <w:pStyle w:val="Compact"/>
+              <w:jc w:val="left"/>
+            </w:pPr>
+            <w:r>
+              <w:t xml:space="preserve">none; the boot ROM waits in software (</w:t>
+            </w:r>
+            <w:r>
+              <w:rPr>
+                <w:rStyle w:val="VerbatimChar"/>
+              </w:rPr>
+              <w:t xml:space="preserve">QNSC_BOOT_SPEC</w:t>
+            </w:r>
+            <w:r>
+              <w:t xml:space="preserve"> </w:t>
+            </w:r>
+            <w:r>
+              <w:t xml:space="preserve">7.5)</w:t>
+            </w:r>
+          </w:p>
+        </w:tc>
+      </w:tr>
     </w:tbl>
-    <w:bookmarkEnd w:id="44"/>
-    <w:bookmarkStart w:id="45" w:name="tie-offs"/>
+    <w:bookmarkEnd w:id="48"/>
+    <w:bookmarkStart w:id="49" w:name="tie-offs"/>
     <w:p>
       <w:pPr>
         <w:pStyle w:val="Heading1"/>
@@ -7372,8 +8746,8 @@
         </w:tc>
       </w:tr>
     </w:tbl>
-    <w:bookmarkEnd w:id="45"/>
-    <w:bookmarkStart w:id="46" w:name="requirements-on-others-and-open-items"/>
+    <w:bookmarkEnd w:id="49"/>
+    <w:bookmarkStart w:id="50" w:name="requirements-on-others-and-open-items"/>
     <w:p>
       <w:pPr>
         <w:pStyle w:val="Heading1"/>
@@ -7639,6 +9013,154 @@
           </w:p>
         </w:tc>
       </w:tr>
+      <w:tr>
+        <w:tc>
+          <w:tcPr/>
+          <w:p>
+            <w:pPr>
+              <w:pStyle w:val="Compact"/>
+              <w:jc w:val="left"/>
+            </w:pPr>
+            <w:r>
+              <w:t xml:space="preserve">The</w:t>
+            </w:r>
+            <w:r>
+              <w:t xml:space="preserve"> </w:t>
+            </w:r>
+            <w:r>
+              <w:rPr>
+                <w:rStyle w:val="VerbatimChar"/>
+              </w:rPr>
+              <w:t xml:space="preserve">DBG_EN</w:t>
+            </w:r>
+            <w:r>
+              <w:t xml:space="preserve"> </w:t>
+            </w:r>
+            <w:r>
+              <w:t xml:space="preserve">pad wired to</w:t>
+            </w:r>
+            <w:r>
+              <w:t xml:space="preserve"> </w:t>
+            </w:r>
+            <w:r>
+              <w:rPr>
+                <w:rStyle w:val="VerbatimChar"/>
+              </w:rPr>
+              <w:t xml:space="preserve">i_dbg_en</w:t>
+            </w:r>
+          </w:p>
+        </w:tc>
+        <w:tc>
+          <w:tcPr/>
+          <w:p>
+            <w:pPr>
+              <w:pStyle w:val="Compact"/>
+              <w:jc w:val="left"/>
+            </w:pPr>
+            <w:r>
+              <w:t xml:space="preserve">top (lead)</w:t>
+            </w:r>
+          </w:p>
+        </w:tc>
+        <w:tc>
+          <w:tcPr/>
+          <w:p>
+            <w:pPr>
+              <w:pStyle w:val="Compact"/>
+              <w:jc w:val="left"/>
+            </w:pPr>
+            <w:r>
+              <w:t xml:space="preserve">7.5</w:t>
+            </w:r>
+          </w:p>
+        </w:tc>
+      </w:tr>
+      <w:tr>
+        <w:tc>
+          <w:tcPr/>
+          <w:p>
+            <w:pPr>
+              <w:pStyle w:val="Compact"/>
+              <w:jc w:val="left"/>
+            </w:pPr>
+            <w:r>
+              <w:t xml:space="preserve">The</w:t>
+            </w:r>
+            <w:r>
+              <w:t xml:space="preserve"> </w:t>
+            </w:r>
+            <w:r>
+              <w:rPr>
+                <w:rStyle w:val="VerbatimChar"/>
+              </w:rPr>
+              <w:t xml:space="preserve">SYSDBG</w:t>
+            </w:r>
+            <w:r>
+              <w:t xml:space="preserve"> </w:t>
+            </w:r>
+            <w:r>
+              <w:t xml:space="preserve">bus master reaches</w:t>
+            </w:r>
+            <w:r>
+              <w:t xml:space="preserve"> </w:t>
+            </w:r>
+            <w:r>
+              <w:rPr>
+                <w:rStyle w:val="VerbatimChar"/>
+              </w:rPr>
+              <w:t xml:space="preserve">APB_M1</w:t>
+            </w:r>
+            <w:r>
+              <w:t xml:space="preserve"> </w:t>
+            </w:r>
+            <w:r>
+              <w:t xml:space="preserve">and writes</w:t>
+            </w:r>
+            <w:r>
+              <w:t xml:space="preserve"> </w:t>
+            </w:r>
+            <w:r>
+              <w:rPr>
+                <w:rStyle w:val="VerbatimChar"/>
+              </w:rPr>
+              <w:t xml:space="preserve">DBG_BOOT</w:t>
+            </w:r>
+          </w:p>
+        </w:tc>
+        <w:tc>
+          <w:tcPr/>
+          <w:p>
+            <w:pPr>
+              <w:pStyle w:val="Compact"/>
+              <w:jc w:val="left"/>
+            </w:pPr>
+            <w:r>
+              <w:rPr>
+                <w:rStyle w:val="VerbatimChar"/>
+              </w:rPr>
+              <w:t xml:space="preserve">SYSDBG</w:t>
+            </w:r>
+            <w:r>
+              <w:t xml:space="preserve"> </w:t>
+            </w:r>
+            <w:r>
+              <w:t xml:space="preserve">(lead)</w:t>
+            </w:r>
+          </w:p>
+        </w:tc>
+        <w:tc>
+          <w:tcPr/>
+          <w:p>
+            <w:pPr>
+              <w:pStyle w:val="Compact"/>
+              <w:jc w:val="left"/>
+            </w:pPr>
+            <w:r>
+              <w:t xml:space="preserve">the end of the debug wait, 7.5</w:t>
+            </w:r>
+          </w:p>
+        </w:tc>
+      </w:tr>
     </w:tbl>
     <w:p/>
     <w:p>
@@ -7928,8 +9450,8 @@
         <w:t xml:space="preserve">Open items: none.</w:t>
       </w:r>
     </w:p>
-    <w:bookmarkEnd w:id="46"/>
-    <w:bookmarkStart w:id="47" w:name="verification"/>
+    <w:bookmarkEnd w:id="50"/>
+    <w:bookmarkStart w:id="51" w:name="verification"/>
     <w:p>
       <w:pPr>
         <w:pStyle w:val="Heading1"/>
@@ -7942,7 +9464,7 @@
       <w:pPr>
         <w:numPr>
           <w:ilvl w:val="0"/>
-          <w:numId w:val="1007"/>
+          <w:numId w:val="1008"/>
         </w:numPr>
         <w:pStyle w:val="Compact"/>
         <w:jc w:val="left"/>
@@ -8018,7 +9540,7 @@
       <w:pPr>
         <w:numPr>
           <w:ilvl w:val="0"/>
-          <w:numId w:val="1007"/>
+          <w:numId w:val="1008"/>
         </w:numPr>
         <w:pStyle w:val="Compact"/>
         <w:jc w:val="left"/>
@@ -8055,7 +9577,7 @@
       <w:pPr>
         <w:numPr>
           <w:ilvl w:val="0"/>
-          <w:numId w:val="1007"/>
+          <w:numId w:val="1008"/>
         </w:numPr>
         <w:pStyle w:val="Compact"/>
         <w:jc w:val="left"/>
@@ -8092,7 +9614,7 @@
       <w:pPr>
         <w:numPr>
           <w:ilvl w:val="0"/>
-          <w:numId w:val="1007"/>
+          <w:numId w:val="1008"/>
         </w:numPr>
         <w:pStyle w:val="Compact"/>
         <w:jc w:val="left"/>
@@ -8129,7 +9651,7 @@
       <w:pPr>
         <w:numPr>
           <w:ilvl w:val="0"/>
-          <w:numId w:val="1007"/>
+          <w:numId w:val="1008"/>
         </w:numPr>
         <w:pStyle w:val="Compact"/>
         <w:jc w:val="left"/>
@@ -8181,7 +9703,7 @@
       <w:pPr>
         <w:numPr>
           <w:ilvl w:val="0"/>
-          <w:numId w:val="1007"/>
+          <w:numId w:val="1008"/>
         </w:numPr>
         <w:pStyle w:val="Compact"/>
         <w:jc w:val="left"/>
@@ -8248,7 +9770,7 @@
       <w:pPr>
         <w:numPr>
           <w:ilvl w:val="0"/>
-          <w:numId w:val="1007"/>
+          <w:numId w:val="1008"/>
         </w:numPr>
         <w:pStyle w:val="Compact"/>
         <w:jc w:val="left"/>
@@ -8300,7 +9822,7 @@
       <w:pPr>
         <w:numPr>
           <w:ilvl w:val="0"/>
-          <w:numId w:val="1007"/>
+          <w:numId w:val="1008"/>
         </w:numPr>
         <w:pStyle w:val="Compact"/>
         <w:jc w:val="left"/>
@@ -8358,7 +9880,7 @@
       <w:pPr>
         <w:numPr>
           <w:ilvl w:val="0"/>
-          <w:numId w:val="1007"/>
+          <w:numId w:val="1008"/>
         </w:numPr>
         <w:pStyle w:val="Compact"/>
         <w:jc w:val="left"/>
@@ -8380,7 +9902,7 @@
       <w:pPr>
         <w:numPr>
           <w:ilvl w:val="0"/>
-          <w:numId w:val="1007"/>
+          <w:numId w:val="1008"/>
         </w:numPr>
         <w:pStyle w:val="Compact"/>
         <w:jc w:val="left"/>
@@ -8428,8 +9950,197 @@
         <w:t xml:space="preserve">only (netlist check).</w:t>
       </w:r>
     </w:p>
-    <w:bookmarkEnd w:id="47"/>
-    <w:bookmarkStart w:id="48" w:name="appendix-a.-acronyms"/>
+    <w:p>
+      <w:pPr>
+        <w:numPr>
+          <w:ilvl w:val="0"/>
+          <w:numId w:val="1008"/>
+        </w:numPr>
+        <w:pStyle w:val="Compact"/>
+        <w:jc w:val="left"/>
+      </w:pPr>
+      <w:r>
+        <w:rPr>
+          <w:rStyle w:val="VerbatimChar"/>
+        </w:rPr>
+        <w:t xml:space="preserve">SYSCSR_011</w:t>
+      </w:r>
+      <w:r>
+        <w:t xml:space="preserve"> </w:t>
+      </w:r>
+      <w:r>
+        <w:t xml:space="preserve">With</w:t>
+      </w:r>
+      <w:r>
+        <w:t xml:space="preserve"> </w:t>
+      </w:r>
+      <w:r>
+        <w:rPr>
+          <w:rStyle w:val="VerbatimChar"/>
+        </w:rPr>
+        <w:t xml:space="preserve">dbg_en_mask</w:t>
+      </w:r>
+      <w:r>
+        <w:t xml:space="preserve"> </w:t>
+      </w:r>
+      <w:r>
+        <w:t xml:space="preserve">= 0,</w:t>
+      </w:r>
+      <w:r>
+        <w:t xml:space="preserve"> </w:t>
+      </w:r>
+      <w:r>
+        <w:rPr>
+          <w:rStyle w:val="VerbatimChar"/>
+        </w:rPr>
+        <w:t xml:space="preserve">DBG_BOOT.dbg_en</w:t>
+      </w:r>
+      <w:r>
+        <w:t xml:space="preserve"> </w:t>
+      </w:r>
+      <w:r>
+        <w:t xml:space="preserve">follows the</w:t>
+      </w:r>
+      <w:r>
+        <w:t xml:space="preserve"> </w:t>
+      </w:r>
+      <w:r>
+        <w:rPr>
+          <w:rStyle w:val="VerbatimChar"/>
+        </w:rPr>
+        <w:t xml:space="preserve">DBG_EN</w:t>
+      </w:r>
+      <w:r>
+        <w:t xml:space="preserve"> </w:t>
+      </w:r>
+      <w:r>
+        <w:t xml:space="preserve">pin</w:t>
+      </w:r>
+      <w:r>
+        <w:t xml:space="preserve"> </w:t>
+      </w:r>
+      <w:r>
+        <w:t xml:space="preserve">two clock edges later, rising and falling.</w:t>
+      </w:r>
+    </w:p>
+    <w:p>
+      <w:pPr>
+        <w:numPr>
+          <w:ilvl w:val="0"/>
+          <w:numId w:val="1008"/>
+        </w:numPr>
+        <w:pStyle w:val="Compact"/>
+        <w:jc w:val="left"/>
+      </w:pPr>
+      <w:r>
+        <w:rPr>
+          <w:rStyle w:val="VerbatimChar"/>
+        </w:rPr>
+        <w:t xml:space="preserve">SYSCSR_012</w:t>
+      </w:r>
+      <w:r>
+        <w:t xml:space="preserve"> </w:t>
+      </w:r>
+      <w:r>
+        <w:t xml:space="preserve">With</w:t>
+      </w:r>
+      <w:r>
+        <w:t xml:space="preserve"> </w:t>
+      </w:r>
+      <w:r>
+        <w:rPr>
+          <w:rStyle w:val="VerbatimChar"/>
+        </w:rPr>
+        <w:t xml:space="preserve">dbg_en_mask</w:t>
+      </w:r>
+      <w:r>
+        <w:t xml:space="preserve"> </w:t>
+      </w:r>
+      <w:r>
+        <w:t xml:space="preserve">= 1,</w:t>
+      </w:r>
+      <w:r>
+        <w:t xml:space="preserve"> </w:t>
+      </w:r>
+      <w:r>
+        <w:rPr>
+          <w:rStyle w:val="VerbatimChar"/>
+        </w:rPr>
+        <w:t xml:space="preserve">dbg_en</w:t>
+      </w:r>
+      <w:r>
+        <w:t xml:space="preserve"> </w:t>
+      </w:r>
+      <w:r>
+        <w:t xml:space="preserve">reads 0 whatever the pin; writing</w:t>
+      </w:r>
+      <w:r>
+        <w:t xml:space="preserve"> </w:t>
+      </w:r>
+      <w:r>
+        <w:rPr>
+          <w:rStyle w:val="VerbatimChar"/>
+        </w:rPr>
+        <w:t xml:space="preserve">dbg_en_mask</w:t>
+      </w:r>
+      <w:r>
+        <w:t xml:space="preserve"> </w:t>
+      </w:r>
+      <w:r>
+        <w:t xml:space="preserve">= 0 shows the pin again.</w:t>
+      </w:r>
+    </w:p>
+    <w:p>
+      <w:pPr>
+        <w:numPr>
+          <w:ilvl w:val="0"/>
+          <w:numId w:val="1008"/>
+        </w:numPr>
+        <w:pStyle w:val="Compact"/>
+        <w:jc w:val="left"/>
+      </w:pPr>
+      <w:r>
+        <w:rPr>
+          <w:rStyle w:val="VerbatimChar"/>
+        </w:rPr>
+        <w:t xml:space="preserve">SYSCSR_013</w:t>
+      </w:r>
+      <w:r>
+        <w:t xml:space="preserve"> </w:t>
+      </w:r>
+      <w:r>
+        <w:t xml:space="preserve">A write to</w:t>
+      </w:r>
+      <w:r>
+        <w:t xml:space="preserve"> </w:t>
+      </w:r>
+      <w:r>
+        <w:rPr>
+          <w:rStyle w:val="VerbatimChar"/>
+        </w:rPr>
+        <w:t xml:space="preserve">DBG_BOOT</w:t>
+      </w:r>
+      <w:r>
+        <w:t xml:space="preserve"> </w:t>
+      </w:r>
+      <w:r>
+        <w:t xml:space="preserve">cannot set</w:t>
+      </w:r>
+      <w:r>
+        <w:t xml:space="preserve"> </w:t>
+      </w:r>
+      <w:r>
+        <w:rPr>
+          <w:rStyle w:val="VerbatimChar"/>
+        </w:rPr>
+        <w:t xml:space="preserve">dbg_en</w:t>
+      </w:r>
+      <w:r>
+        <w:t xml:space="preserve">, and bits 31:2 read 0.</w:t>
+      </w:r>
+    </w:p>
+    <w:bookmarkEnd w:id="51"/>
+    <w:bookmarkStart w:id="52" w:name="appendix-a.-acronyms"/>
     <w:p>
       <w:pPr>
         <w:pStyle w:val="Heading1"/>
@@ -8653,8 +10364,8 @@
         </w:tc>
       </w:tr>
     </w:tbl>
-    <w:bookmarkEnd w:id="48"/>
-    <w:bookmarkStart w:id="49" w:name="appendix-b.-first-review"/>
+    <w:bookmarkEnd w:id="52"/>
+    <w:bookmarkStart w:id="53" w:name="appendix-b.-first-review"/>
     <w:p>
       <w:pPr>
         <w:pStyle w:val="Heading1"/>
@@ -9253,8 +10964,138 @@
           </w:p>
         </w:tc>
       </w:tr>
+      <w:tr>
+        <w:tc>
+          <w:tcPr/>
+          <w:p>
+            <w:pPr>
+              <w:pStyle w:val="Compact"/>
+              <w:jc w:val="left"/>
+            </w:pPr>
+            <w:r>
+              <w:rPr>
+                <w:rStyle w:val="VerbatimChar"/>
+              </w:rPr>
+              <w:t xml:space="preserve">SYSCSR.DEBUG_EN</w:t>
+            </w:r>
+            <w:r>
+              <w:t xml:space="preserve"> </w:t>
+            </w:r>
+            <w:r>
+              <w:t xml:space="preserve">status bit, from the pin through two flip-flops, and</w:t>
+            </w:r>
+            <w:r>
+              <w:t xml:space="preserve"> </w:t>
+            </w:r>
+            <w:r>
+              <w:rPr>
+                <w:rStyle w:val="VerbatimChar"/>
+              </w:rPr>
+              <w:t xml:space="preserve">DEBUG_EN_MASK</w:t>
+            </w:r>
+            <w:r>
+              <w:t xml:space="preserve"> </w:t>
+            </w:r>
+            <w:r>
+              <w:t xml:space="preserve">written over JTAG to force it to 0</w:t>
+            </w:r>
+          </w:p>
+        </w:tc>
+        <w:tc>
+          <w:tcPr/>
+          <w:p>
+            <w:pPr>
+              <w:pStyle w:val="Compact"/>
+              <w:jc w:val="left"/>
+            </w:pPr>
+            <w:r>
+              <w:t xml:space="preserve">Quan (mentor), 12/10 drawing</w:t>
+            </w:r>
+          </w:p>
+        </w:tc>
+        <w:tc>
+          <w:tcPr/>
+          <w:p>
+            <w:pPr>
+              <w:pStyle w:val="Compact"/>
+              <w:jc w:val="left"/>
+            </w:pPr>
+            <w:r>
+              <w:rPr>
+                <w:rStyle w:val="VerbatimChar"/>
+              </w:rPr>
+              <w:t xml:space="preserve">DBG_BOOT</w:t>
+            </w:r>
+            <w:r>
+              <w:t xml:space="preserve">, 6, 7.5</w:t>
+            </w:r>
+          </w:p>
+        </w:tc>
+      </w:tr>
+      <w:tr>
+        <w:tc>
+          <w:tcPr/>
+          <w:p>
+            <w:pPr>
+              <w:pStyle w:val="Compact"/>
+              <w:jc w:val="left"/>
+            </w:pPr>
+            <w:r>
+              <w:t xml:space="preserve">Only power-on resets the debug part</w:t>
+            </w:r>
+          </w:p>
+        </w:tc>
+        <w:tc>
+          <w:tcPr/>
+          <w:p>
+            <w:pPr>
+              <w:pStyle w:val="Compact"/>
+              <w:jc w:val="left"/>
+            </w:pPr>
+            <w:r>
+              <w:t xml:space="preserve">Quan (mentor), 12/10, confirmed</w:t>
+            </w:r>
+          </w:p>
+        </w:tc>
+        <w:tc>
+          <w:tcPr/>
+          <w:p>
+            <w:pPr>
+              <w:pStyle w:val="Compact"/>
+              <w:jc w:val="left"/>
+            </w:pPr>
+            <w:r>
+              <w:t xml:space="preserve">7.5:</w:t>
+            </w:r>
+            <w:r>
+              <w:t xml:space="preserve"> </w:t>
+            </w:r>
+            <w:r>
+              <w:rPr>
+                <w:rStyle w:val="VerbatimChar"/>
+              </w:rPr>
+              <w:t xml:space="preserve">dbg_en_mask</w:t>
+            </w:r>
+            <w:r>
+              <w:t xml:space="preserve"> </w:t>
+            </w:r>
+            <w:r>
+              <w:t xml:space="preserve">and the synchroniser on</w:t>
+            </w:r>
+            <w:r>
+              <w:t xml:space="preserve"> </w:t>
+            </w:r>
+            <w:r>
+              <w:rPr>
+                <w:rStyle w:val="VerbatimChar"/>
+              </w:rPr>
+              <w:t xml:space="preserve">i_rst_n_por</w:t>
+            </w:r>
+          </w:p>
+        </w:tc>
+      </w:tr>
     </w:tbl>
-    <w:bookmarkEnd w:id="49"/>
+    <w:bookmarkEnd w:id="53"/>
     <w:sectPr>
       <w:headerReference r:id="rId9" w:type="default"/>
       <w:footerReference r:id="rId11" w:type="even"/>
@@ -9493,7 +11334,7 @@
       <w:rPr>
         <w:szCs w:val="26"/>
       </w:rPr>
-      <w:t>V3.1</w:t>
+      <w:t>V3.2</w:t>
     </w:r>
     <w:r>
       <w:rPr>
@@ -11361,6 +13202,9 @@
     <w:abstractNumId w:val="991"/>
   </w:num>
   <w:num w:numId="1007">
+    <w:abstractNumId w:val="991"/>
+  </w:num>
+  <w:num w:numId="1008">
     <w:abstractNumId w:val="99411"/>
     <w:lvlOverride w:ilvl="0">
       <w:startOverride w:val="1"/>

</xml_diff>